<commit_message>
Weekly summary: 2026-05-04 to 2026-05-08
</commit_message>
<xml_diff>
--- a/2026/05/weekly/Architecture-Note-2026-W18.docx
+++ b/2026/05/weekly/Architecture-Note-2026-W18.docx
@@ -7,12 +7,13 @@
         <w:pStyle w:val="Title"/>
       </w:pPr>
       <w:r>
-        <w:t>Architecture Note: Span of Control in Agentic Systems and the Productization Boundary (Week 18, 2026)</w:t>
+        <w:t>Architecture Note: Agent Discipline and Architecture Transfer (Week 18, 2026)</w:t>
       </w:r>
     </w:p>
     <w:p>
+      <w:pPr/>
       <w:r>
-        <w:t>The week surfaced two connected architectural arguments. The first concerns how many tools an LLM agent can reliably orchestrate before reliability degrades. The second concerns where to draw the boundary between an internal platform and its productized derivative. Both reduce to the same underlying question: when does adding scope to a system create liability rather than capability? The week's meetings tested these boundaries through concrete design decisions on clinical AI agents and a knowledge transfer engagement for platform productization.</w:t>
+        <w:t>The week posed two architectural questions that connect through the problem of encoding tacit knowledge into transferable structure. The first question: how do you design an agent's tool surface so it remains reliable in clinical settings? The second: how do you transfer architectural understanding of a system built for one institution to a team that must rebuild it for multiple deployment contexts? Both required moving from implicit developer intuition toward explicit design constraints that survive the handoff to someone who was not in the room when the original decisions were made.</w:t>
       </w:r>
     </w:p>
     <w:p>
@@ -20,37 +21,37 @@
         <w:pStyle w:val="Heading1"/>
       </w:pPr>
       <w:r>
-        <w:t>Tool Decomposition and the Span of Control Principle</w:t>
+        <w:t>Scoped Tools and the Span-of-Control Discipline</w:t>
       </w:r>
     </w:p>
     <w:p>
+      <w:pPr/>
       <w:r>
-        <w:t>Thursday's agentic design review established a design constraint: no agent should have access to more than five to ten tools, and each tool must carry clear semantic meaning. The rationale emerged from direct observation. When an agent is given access to a monolithic orchestrator capable of retrieving any data type (notes, labs, orders, imaging), reliability degrades. The orchestrator's comprehensive capability becomes a liability because the agent lacks semantic cues to select appropriate retrieval strategies.</w:t>
+        <w:t>Thursday's agent architecture review surfaced a pattern that had been building all week. A colleague reported that a previous project had exposed a clinical data orchestrator directly to an agent. The orchestrator could retrieve any data type from the EHR, which seemed elegant in design. In practice, the tool's poor documentation forced the team to write explicit calling instructions for the agent, which defeated the purpose of using an agent in the first place. The workaround became the architecture.</w:t>
       </w:r>
     </w:p>
     <w:p>
+      <w:pPr/>
       <w:r>
-        <w:t>This finding aligns with Anthropic's engineering guidance on agent-computer interface design. The guidance emphasizes that tool design quality matters more than tool count, recommending that developers "invest as much effort in agent-computer interfaces as human-computer interfaces" (Anthropic, 2024). The SWE-bench case study in that guidance documents how requiring absolute filepaths eliminated errors that occurred with relative paths. Small changes to tool interface design yielded disproportionate reliability improvements.</w:t>
+        <w:t>The FHIR-AgentBench benchmark from Lee et al. (2025) illuminates why this happens. Their evaluation of 2,931 real-world clinical questions against agents retrieving data from FHIR resources demonstrated that intricate resource structures and multi-step reasoning chains critically affect performance. Exposing individual FHIR APIs as separate tools (notes, labs, orders) rather than bundling them into a universal retrieval function reduced this complexity. The benchmark provides empirical grounding for what the team discovered through trial: scoped tools with prescriptive instructions outperform flexible-but-ambiguous interfaces.</w:t>
       </w:r>
     </w:p>
     <w:p>
+      <w:pPr/>
       <w:r>
-        <w:t>The analogy to incident management is instructive. The National Incident Management System establishes that no supervisor should manage more than seven direct reports during emergency response (Federal Emergency Management Agency, 2017). This span of control principle emerged from coordination failures during the 1970 California wildfires and was refined after 9/11. The principle exists because cognitive load limits effective coordination regardless of the supervisor's competence.</w:t>
+        <w:t>The team adopted a rough guideline of limiting agents to approximately ten tools maximum, borrowing from emergency response management's span-of-control principle. Anthropic's Building Effective Agents guide (2024) reinforces this intuition, though from a different angle. Their guidance emphasizes that tool definitions deserve as much prompt engineering attention as overall prompts. The poka-yoke principle applies: absolute filepaths beat relative ones, and prescriptive instructions beat open-ended interfaces. The SWE-bench implementation from Anthropic spent more time optimizing tools than the overall prompt.</w:t>
       </w:r>
     </w:p>
     <w:p>
+      <w:pPr/>
       <w:r>
-        <w:t>The week's design decision applied this principle to tool-calling architectures. Decomposing a monolithic Fire orchestrator into scoped tools (notes retrieval, laboratory values, orders, imaging) provides the agent with decision-relevant structure. The agent can reason about which category of clinical data to retrieve rather than navigating a generic "retrieve anything" interface.</w:t>
+        <w:t>Hu's empirical study of 70 agent-system projects (2026) provides additional context. The research identifies five recurring architectural dimensions: subagent architecture, context management, tool systems, safety mechanisms, and orchestration. Registry-oriented tool systems remain dominant, with formalized tool-registration boundaries aligning with broader ecosystem goals. The pattern of deeper coordination correlating with explicit context services suggests that agent reliability emerges from structural discipline, not capability breadth.</w:t>
       </w:r>
     </w:p>
     <w:p>
+      <w:pPr/>
       <w:r>
-        <w:t>The ReAct framework documented by Yao et al. (2022) provides additional grounding. By interleaving reasoning traces with tool calls, ReAct demonstrated a 34% absolute improvement in success rate on ALFWorld benchmarks compared to methods that separate reasoning from action. The framework "overcomes issues of hallucination and error propagation prevalent in chain-of-thought reasoning by interacting with a simple Wikipedia API" (Yao et al., 2022). The implication for clinical AI is that interpretable reasoning-action loops require tools with clear semantic boundaries.</w:t>
-      </w:r>
-    </w:p>
-    <w:p>
-      <w:r>
-        <w:t>The evaluation framework discussion on Thursday raised a related question: how should organizations handle deployment when evaluation cost scales with criteria configurability? A novel framing emerged treating rigorous evaluation as an opt-in service rather than a deployment prerequisite. Clinical teams with publication motivations may invest in detailed annotation and evaluation infrastructure. Operational teams may accept deployment with explicit acknowledgment of uncharacterized failure modes. This mirrors the pharmaceutical distinction between approved indications and off-label use.</w:t>
+        <w:t>A secondary tension emerged during Thursday's discussion: whether a custom tool-calling architecture is justified when a simple prompt to the chat completion API achieves 90 to 95 percent accuracy. If the simpler approach works, the agentic complexity is overhead. The team did not resolve this question. Evaluation remains unclear when routing criteria are user-configurable and change frequently. The RAG literature offers partial guidance. Ke et al. (2024) demonstrated that an LLM-RAG pipeline for preoperative medicine achieved 91.4% accuracy when grounded in 35 clinical guidelines, matching human clinician performance. But their success depended on a curated, bounded knowledge base. Dynamic criteria create evaluation scope questions that static benchmarks do not address.</w:t>
       </w:r>
     </w:p>
     <w:p>
@@ -58,37 +59,37 @@
         <w:pStyle w:val="Heading1"/>
       </w:pPr>
       <w:r>
-        <w:t>Platform Productization and Organizational Boundary Management</w:t>
+        <w:t>Productization as Architecture Transfer</w:t>
       </w:r>
     </w:p>
     <w:p>
+      <w:pPr/>
       <w:r>
-        <w:t>Wednesday's executive strategy session clarified the structure of a healthcare organization's effort to productize an internal clinical AI platform. The healthcare organization will own a new entity. An external vendor specializing in pharmaceutical IT will handle containerization and implementation. The internal team's role is knowledge transfer only; the external team determines the productized architecture.</w:t>
+        <w:t>Friday's knowledge transfer session with the implementation partner brought the week's second thread into focus. The healthcare organization is commercializing its clinical AI tool through a newly formed spinoff entity. The implementation partner provides engineering capacity for productization while the parent organization retains ownership. The question is not code sharing; the partner will maintain a separate codebase. The question is how to transfer architectural patterns and operational lessons that are not documented anywhere.</w:t>
       </w:r>
     </w:p>
     <w:p>
+      <w:pPr/>
       <w:r>
-        <w:t>Friday's knowledge transfer session operationalized this boundary. The session covered Fire orchestration patterns, asynchronous chunking for long clinical documents, and model routing strategies. The discussion of context window management was particularly detailed: the platform implements an 80% threshold per user message with conditional compression when approaching limits. These patterns work within the internal environment but require architectural decisions about what translates to a productized offering versus what remains implementation-specific.</w:t>
+        <w:t>The two-hour kickoff session addressed the full stack: authentication via SMART on FHIR following the HL7 v2.2.0 specification, real-time data fetching through FHIR APIs, tokenization and chunking for large patient records, routing to multiple LLM providers through a proxy gateway, and persistence in blob storage and document databases. The SMART App Launch specification establishes OAuth 2.0-based patterns for client applications to authorize, authenticate, and integrate with FHIR-based data systems. For user-facing applications with launch context (such as sharing the currently selected patient from an EHR session), the specification defines the SMART App Launch pattern. For headless or automated applications, it defines SMART Backend Services. These patterns are transferable; the implementation partner can reference the same specification.</w:t>
       </w:r>
     </w:p>
     <w:p>
+      <w:pPr/>
       <w:r>
-        <w:t>The decision to maintain a separate codebase and infrastructure for the product entity reflects a common pattern in healthcare IT productization. Delta Sharing provides a reference model for this kind of boundary management. The Databricks documentation describes Delta Sharing as enabling "secure data sharing with other organizations regardless of the computing platforms they use" through an open protocol that separates compute from storage governance (Databricks, 2024). Recipients access data in read-only format through pre-signed short-lived URLs without requiring data replication.</w:t>
+        <w:t>The most technically significant discussion centered on context compression. Patient records routinely exceed two million tokens, requiring a map-reduce style approach. The system chunks the record, compresses each chunk independently, then consolidates the compressed outputs. This pattern appears in recent prompt compression research. Hu et al. (2026) describe BEAVER, a hierarchical prompt compression method that shifts from linear token removal to structure-aware selection, achieving 26.4x latency improvement on 128k contexts. Berton et al. (2025) present CompLLM, which divides context into segments for independent compression with linear scaling. The clinical AI system's approach follows the segment-then-consolidate pattern, though the specific implementation details remain proprietary.</w:t>
       </w:r>
     </w:p>
     <w:p>
+      <w:pPr/>
       <w:r>
-        <w:t>The productization architecture faces a similar question: how do you share capability without sharing implementation? The knowledge transfer sessions are documenting patterns (Fire pagination, binary object retrieval, token limit management) that the external team can reimplement in their own infrastructure. The IP transfer includes these patterns as licensable knowledge, not as runnable code.</w:t>
+        <w:t>The implementation partner asked detailed questions about containerization, security hardening, CI/CD processes, and deployment topology for external customers. These questions reflect the core challenge of productization: the original system was built for a single institution's identity provider, middleware stack, and model access arrangements. External customers will have different configurations. The APPFLx framework from Hoang et al. (2023) provides a reference pattern for infrastructure-agnostic healthcare systems. Their work on federated learning across heterogeneous computing environments demonstrates that designing for deployment variability from the start reduces retrofitting costs. Thursday's research application architecture session reached the same conclusion: Docker containerization with Terraform for environment provisioning enables portability across cloud providers.</w:t>
       </w:r>
     </w:p>
     <w:p>
+      <w:pPr/>
       <w:r>
-        <w:t>TEFCA provides another reference model for federated governance across organizational boundaries. The framework establishes "a universal floor for interoperability" through a network-of-networks model where Qualified Health Information Networks serve as connection points (Office of the National Coordinator for Health Information Technology, 2024). By December 2025, TEFCA had facilitated nearly 500 million health record exchanges. The three-tier structure (Common Agreement, Trusted Exchange Framework, QHIN Technical Framework) separates legal contracts from technical specifications, allowing organizations to maintain implementation autonomy while meeting baseline requirements.</w:t>
-      </w:r>
-    </w:p>
-    <w:p>
-      <w:r>
-        <w:t>The week's data platform discussions employed a similar pattern. Delta sharing with enclave isolation enables research teams to query production data without ETL duplication. Unity Catalog provides the governance layer. The question of how IRB workflows integrate with enclave provisioning remains open, but the architectural pattern is established: separate the governance model from the compute model.</w:t>
+        <w:t>The knowledge transfer is not about code. It is about encoding the decisions that are not visible in the code. Why does model selection follow token count thresholds rather than task type? Because evaluation runs against three months of production logs showed latency matters more than capability ceiling for clinical workflows. Why does the system use real-time FHIR retrieval rather than pre-indexing? Because data freshness requirements exceed what periodic indexing can guarantee. These rationales must be documented explicitly for the implementation partner to make appropriate modifications for different deployment contexts.</w:t>
       </w:r>
     </w:p>
     <w:p>
@@ -104,7 +105,7 @@
         <w:pStyle w:val="ListBullet"/>
       </w:pPr>
       <w:r>
-        <w:t>Cloud environment selection: GCP for initial research platform development; container orchestration preserves Azure migration path</w:t>
+        <w:t>Agent tool design: scoped tools (separate functions for notes, labs, orders) rather than monolithic orchestrators</w:t>
       </w:r>
     </w:p>
     <w:p>
@@ -112,7 +113,7 @@
         <w:pStyle w:val="ListBullet"/>
       </w:pPr>
       <w:r>
-        <w:t>Agent tool design: decompose monolithic orchestrator into scoped, semantically meaningful tools (5-10 maximum per agent)</w:t>
+        <w:t>Agent tool limit: approximately ten tools maximum as a design constraint</w:t>
       </w:r>
     </w:p>
     <w:p>
@@ -120,7 +121,7 @@
         <w:pStyle w:val="ListBullet"/>
       </w:pPr>
       <w:r>
-        <w:t>Productization structure: separate codebase and infrastructure for spin-off product entity; internal team provides knowledge transfer only</w:t>
+        <w:t>Knowledge transfer: architectural patterns and operational lessons transfer through documentation, not code sharing</w:t>
       </w:r>
     </w:p>
     <w:p>
@@ -128,7 +129,7 @@
         <w:pStyle w:val="ListBullet"/>
       </w:pPr>
       <w:r>
-        <w:t>Data platform pattern: Delta sharing with enclave isolation; Unity Catalog for governance; treat agent configuration as code</w:t>
+        <w:t>Research application: GCP initial environment with Docker and Terraform for portability to other providers</w:t>
       </w:r>
     </w:p>
     <w:p>
@@ -136,7 +137,23 @@
         <w:pStyle w:val="ListBullet"/>
       </w:pPr>
       <w:r>
-        <w:t>Authentication: support multiple identity providers for affiliated organization access across research platform</w:t>
+        <w:t>Research application: agent configuration files managed through CI/CD pipelines, not SharePoint</w:t>
+      </w:r>
+    </w:p>
+    <w:p>
+      <w:pPr>
+        <w:pStyle w:val="ListBullet"/>
+      </w:pPr>
+      <w:r>
+        <w:t>Autonomous billing coding pilot: approved with 95% accuracy threshold for production and model drift monitoring requirements</w:t>
+      </w:r>
+    </w:p>
+    <w:p>
+      <w:pPr>
+        <w:pStyle w:val="ListBullet"/>
+      </w:pPr>
+      <w:r>
+        <w:t>Medical imaging workflow migration: approved with Active Directory waiver, remediation expected by March 2027</w:t>
       </w:r>
     </w:p>
     <w:p>
@@ -152,7 +169,7 @@
         <w:pStyle w:val="ListBullet"/>
       </w:pPr>
       <w:r>
-        <w:t>How does evaluation cost scale when end users can modify eligibility criteria weekly? Is opt-in rigorous evaluation economically viable?</w:t>
+        <w:t>Agent evaluation: how do you measure system accuracy when routing criteria are user-configurable and change frequently?</w:t>
       </w:r>
     </w:p>
     <w:p>
@@ -160,7 +177,7 @@
         <w:pStyle w:val="ListBullet"/>
       </w:pPr>
       <w:r>
-        <w:t>Where does the boundary between the internal platform's evolution and the productized fork get managed over time?</w:t>
+        <w:t>Context compression: the segment-then-consolidate pattern works, but the boundary between institution-specific implementation and transferable pattern requires documentation</w:t>
       </w:r>
     </w:p>
     <w:p>
@@ -168,7 +185,7 @@
         <w:pStyle w:val="ListBullet"/>
       </w:pPr>
       <w:r>
-        <w:t>How do IRB workflows integrate with enclave provisioning for the data platform?</w:t>
+        <w:t>Productization scope: which security hardening items (TLS verification, JWT validation, hardcoded keys) are institution-specific versus transferable?</w:t>
       </w:r>
     </w:p>
     <w:p>
@@ -176,7 +193,7 @@
         <w:pStyle w:val="ListBullet"/>
       </w:pPr>
       <w:r>
-        <w:t>What silent deployment or shadow environment process should govern clinical automation enhancements?</w:t>
+        <w:t>Operations ownership: infrastructure operations ownership for the data platform remains unresolved pending follow-up with platform leadership</w:t>
       </w:r>
     </w:p>
     <w:p>
@@ -188,8 +205,9 @@
       </w:r>
     </w:p>
     <w:p>
+      <w:pPr/>
       <w:r>
-        <w:t>The 5-10 tool limit is a testable hypothesis. The next design review should measure whether reliability improves when Fire data retrieval is decomposed into semantically scoped tools versus a single comprehensive orchestrator.</w:t>
+        <w:t>The FHIR-AgentBench dataset and evaluation suite warrant review for establishing a baseline before investing further in agentic architecture for clinical decision support.</w:t>
       </w:r>
     </w:p>
     <w:p>
@@ -201,76 +219,97 @@
       </w:r>
     </w:p>
     <w:p>
+      <w:pPr>
+        <w:pStyle w:val="ListNumber"/>
+      </w:pPr>
       <w:r>
-        <w:t>1. Anthropic. (2024). Building effective agents. Anthropic Engineering. https://www.anthropic.com/engineering/building-effective-agents</w:t>
+        <w:t>Anthropic. (2024). Building effective agents. https://www.anthropic.com/research/building-effective-agents</w:t>
       </w:r>
     </w:p>
     <w:p>
+      <w:pPr>
+        <w:pStyle w:val="ListNumber"/>
+      </w:pPr>
       <w:r>
-        <w:t>2. Databricks. (2024). Delta Sharing: An open protocol for secure data sharing. https://docs.databricks.com/en/delta-sharing/index.html</w:t>
+        <w:t>Berton, G., Unnikrishnan, J., Tran, S., &amp; Shah, M. (2025). CompLLM: Compression for long context Q&amp;A. arXiv preprint. https://arxiv.org/abs/2509.19228</w:t>
       </w:r>
     </w:p>
     <w:p>
+      <w:pPr>
+        <w:pStyle w:val="ListNumber"/>
+      </w:pPr>
       <w:r>
-        <w:t>3. Federal Emergency Management Agency. (2017). National Incident Management System (3rd ed.). U.S. Department of Homeland Security. https://www.fema.gov/sites/default/files/2020-07/fema_nims_doctrine-2017.pdf</w:t>
+        <w:t>Gao, Y., Xiong, Y., Gao, X., Jia, K., Pan, J., Bi, Y., Dai, Y., Sun, J., Wang, M., &amp; Wang, H. (2023). Retrieval-augmented generation for large language models: A survey. arXiv preprint. https://arxiv.org/abs/2312.10997</w:t>
       </w:r>
     </w:p>
     <w:p>
+      <w:pPr>
+        <w:pStyle w:val="ListNumber"/>
+      </w:pPr>
       <w:r>
-        <w:t>4. Gao, Y., Xiong, Y., Gao, X., Jia, K., Pan, J., Bi, Y., Dai, Y., Sun, J., Wang, M., &amp; Wang, H. (2024). Retrieval-augmented generation for large language models: A survey. arXiv preprint arXiv:2312.10997. https://arxiv.org/abs/2312.10997</w:t>
+        <w:t>HL7 International. (2023). SMART App Launch v2.2.0 (FHIR Implementation Guide). https://hl7.org/fhir/smart-app-launch/</w:t>
       </w:r>
     </w:p>
     <w:p>
+      <w:pPr>
+        <w:pStyle w:val="ListNumber"/>
+      </w:pPr>
       <w:r>
-        <w:t>5. Guo, T., Chen, X., Wang, Y., Chang, R., Pei, S., Chawla, N. V., Wiest, O., &amp; Zhang, X. (2024). Large language model based multi-agents: A survey of progress and challenges. arXiv preprint arXiv:2402.01680. https://arxiv.org/abs/2402.01680</w:t>
+        <w:t>Hoang, T.-H., Fuhrman, J., Madduri, R., Li, M., Chaturvedi, P., Li, Z., Kim, K., Ryu, M., Chard, R., Huerta, E. A., &amp; Giger, M. (2023). Enabling end-to-end secure federated learning in biomedical research on heterogeneous computing environments with APPFLx. arXiv preprint. https://arxiv.org/abs/2312.08701</w:t>
       </w:r>
     </w:p>
     <w:p>
+      <w:pPr>
+        <w:pStyle w:val="ListNumber"/>
+      </w:pPr>
       <w:r>
-        <w:t>6. Office of the National Coordinator for Health Information Technology. (2024). Trusted Exchange Framework and Common Agreement (TEFCA). U.S. Department of Health and Human Services. https://www.healthit.gov/topic/interoperability/trusted-exchange-framework-and-common-agreement-tefca</w:t>
+        <w:t>Hu, W. (2026). Architectural design decisions in AI agent harnesses. arXiv preprint. https://arxiv.org/abs/2604.18071</w:t>
       </w:r>
     </w:p>
     <w:p>
+      <w:pPr>
+        <w:pStyle w:val="ListNumber"/>
+      </w:pPr>
       <w:r>
-        <w:t>7. Singhal, K., Tu, T., Gottweis, J., Sayres, R., Wulczyn, E., Hou, L., ... &amp; Natarajan, V. (2023). Towards expert-level medical question answering with large language models. arXiv preprint arXiv:2305.09617. https://arxiv.org/abs/2305.09617</w:t>
+        <w:t>Hu, Z., Li, K., Fu, D., Zeng, C., Li, Y., Tang, Y., &amp; Huang, J. (2026). BEAVER: A training-free hierarchical prompt compression method via structure-aware page selection. arXiv preprint. https://arxiv.org/abs/2603.19635</w:t>
       </w:r>
     </w:p>
     <w:p>
+      <w:pPr>
+        <w:pStyle w:val="ListNumber"/>
+      </w:pPr>
       <w:r>
-        <w:t>8. Wang, L., Ma, C., Feng, X., Zhang, Z., Yang, H., Zhang, J., ... &amp; Wen, J.-R. (2024). A survey on large language model based autonomous agents. arXiv preprint arXiv:2308.11432. https://arxiv.org/abs/2308.11432</w:t>
+        <w:t>Ke, Y., Jin, L., Elangovan, K., Abdullah, H. R., Liu, N., Sia, A. T. H., Soh, C. R., Tung, J. Y. M., Ong, J. C. L., &amp; Ting, D. S. W. (2024). Development and testing of retrieval augmented generation in large language models: A case study report. arXiv preprint. https://arxiv.org/abs/2402.01733</w:t>
       </w:r>
     </w:p>
     <w:p>
+      <w:pPr>
+        <w:pStyle w:val="ListNumber"/>
+      </w:pPr>
       <w:r>
-        <w:t>9. Xiong, G., Jin, Q., Lu, Z., &amp; Zhang, A. (2024). Benchmarking retrieval-augmented generation for medicine. arXiv preprint arXiv:2402.13178. https://arxiv.org/abs/2402.13178</w:t>
+        <w:t>Lee, G., Bach, E., Yang, E., Pollard, T., Johnson, A., Choi, E., Jia, Y., &amp; Lee, J. H. (2025). FHIR-AgentBench: Benchmarking LLM agents for realistic interoperable EHR question answering. ML4H 2025 Proceedings. https://arxiv.org/abs/2509.19319</w:t>
       </w:r>
     </w:p>
     <w:p>
-      <w:r>
-        <w:t>10. Yao, S., Zhao, J., Yu, D., Du, N., Shafran, I., Narasimhan, K., &amp; Cao, Y. (2023). ReAct: Synergizing reasoning and acting in language models. Proceedings of the International Conference on Learning Representations. https://arxiv.org/abs/2210.03629</w:t>
-      </w:r>
-    </w:p>
-    <w:p>
-      <w:r>
-        <w:t>________________________________________________________________________________</w:t>
-      </w:r>
-    </w:p>
-    <w:p>
+      <w:pPr/>
       <w:r>
         <w:t>Author: Elvis Jones, Senior Solutions Architect for Clinical AI at an academic medical center.</w:t>
       </w:r>
     </w:p>
     <w:p>
+      <w:pPr/>
       <w:r>
         <w:t>Doctoral candidate in big data analytics at Colorado Technical University.</w:t>
       </w:r>
     </w:p>
     <w:p>
+      <w:pPr/>
       <w:r>
         <w:t>LinkedIn: https://www.linkedin.com/in/elvis-jones-mba-pmp/</w:t>
       </w:r>
     </w:p>
     <w:p>
+      <w:pPr/>
       <w:r>
         <w:t>GitHub: https://github.com/AriesEmber</w:t>
       </w:r>

</xml_diff>